<commit_message>
fixed title in the 1.13 document
</commit_message>
<xml_diff>
--- a/Part_1/Part1_13/1_13.docx
+++ b/Part_1/Part1_13/1_13.docx
@@ -59,7 +59,6 @@
                                 <w:lang w:val="en-US"/>
                               </w:rPr>
                             </w:pPr>
-                            <w:proofErr w:type="spellStart"/>
                             <w:r>
                               <w:rPr>
                                 <w:b/>
@@ -69,19 +68,7 @@
                                 <w:szCs w:val="52"/>
                                 <w:lang w:val="en-US"/>
                               </w:rPr>
-                              <w:t>DecOps</w:t>
-                            </w:r>
-                            <w:proofErr w:type="spellEnd"/>
-                            <w:r>
-                              <w:rPr>
-                                <w:b/>
-                                <w:bCs/>
-                                <w:color w:val="FFFFFF" w:themeColor="background1"/>
-                                <w:sz w:val="52"/>
-                                <w:szCs w:val="52"/>
-                                <w:lang w:val="en-US"/>
-                              </w:rPr>
-                              <w:t xml:space="preserve"> with Docker</w:t>
+                              <w:t>DecOps with Docker</w:t>
                             </w:r>
                           </w:p>
                           <w:p>
@@ -147,7 +134,6 @@
                           <w:lang w:val="en-US"/>
                         </w:rPr>
                       </w:pPr>
-                      <w:proofErr w:type="spellStart"/>
                       <w:r>
                         <w:rPr>
                           <w:b/>
@@ -157,19 +143,7 @@
                           <w:szCs w:val="52"/>
                           <w:lang w:val="en-US"/>
                         </w:rPr>
-                        <w:t>DecOps</w:t>
-                      </w:r>
-                      <w:proofErr w:type="spellEnd"/>
-                      <w:r>
-                        <w:rPr>
-                          <w:b/>
-                          <w:bCs/>
-                          <w:color w:val="FFFFFF" w:themeColor="background1"/>
-                          <w:sz w:val="52"/>
-                          <w:szCs w:val="52"/>
-                          <w:lang w:val="en-US"/>
-                        </w:rPr>
-                        <w:t xml:space="preserve"> with Docker</w:t>
+                        <w:t>DecOps with Docker</w:t>
                       </w:r>
                     </w:p>
                     <w:p>
@@ -784,6 +758,13 @@
           <w:color w:val="595959" w:themeColor="text1" w:themeTint="A6"/>
           <w:lang w:val="en-US"/>
         </w:rPr>
+        <w:t>3</w:t>
+      </w:r>
+      <w:r>
+        <w:rPr>
+          <w:color w:val="595959" w:themeColor="text1" w:themeTint="A6"/>
+          <w:lang w:val="en-US"/>
+        </w:rPr>
         <w:t xml:space="preserve">: </w:t>
       </w:r>
       <w:r>
@@ -1260,25 +1241,35 @@
           <w:bCs/>
           <w:lang w:val="en-US"/>
         </w:rPr>
-        <w:t xml:space="preserve">apt-get update &amp;&amp; apt-get -y install </w:t>
-      </w:r>
-      <w:proofErr w:type="spellStart"/>
+        <w:t>apt-get update &amp;&amp; apt-get -y install wget tar</w:t>
+      </w:r>
       <w:r>
         <w:rPr>
           <w:b/>
           <w:bCs/>
           <w:lang w:val="en-US"/>
         </w:rPr>
-        <w:t>wget</w:t>
-      </w:r>
-      <w:proofErr w:type="spellEnd"/>
+        <w:t xml:space="preserve"> </w:t>
+      </w:r>
+      <w:r>
+        <w:rPr>
+          <w:lang w:val="en-US"/>
+        </w:rPr>
+        <w:t>to</w:t>
+      </w:r>
+      <w:r>
+        <w:rPr>
+          <w:lang w:val="en-US"/>
+        </w:rPr>
+        <w:t xml:space="preserve"> download wget in order to run </w:t>
+      </w:r>
       <w:r>
         <w:rPr>
           <w:b/>
           <w:bCs/>
           <w:lang w:val="en-US"/>
         </w:rPr>
-        <w:t xml:space="preserve"> tar</w:t>
+        <w:t>wget https://go.dev/dl/go1.16.15.linux-amd64.tar.gz</w:t>
       </w:r>
       <w:r>
         <w:rPr>
@@ -1292,45 +1283,50 @@
         <w:rPr>
           <w:lang w:val="en-US"/>
         </w:rPr>
-        <w:t>to</w:t>
-      </w:r>
-      <w:r>
-        <w:rPr>
-          <w:lang w:val="en-US"/>
-        </w:rPr>
-        <w:t xml:space="preserve"> download </w:t>
-      </w:r>
-      <w:proofErr w:type="spellStart"/>
-      <w:r>
-        <w:rPr>
-          <w:lang w:val="en-US"/>
-        </w:rPr>
-        <w:t>wget</w:t>
-      </w:r>
-      <w:proofErr w:type="spellEnd"/>
-      <w:r>
-        <w:rPr>
-          <w:lang w:val="en-US"/>
-        </w:rPr>
-        <w:t xml:space="preserve"> in order to run </w:t>
-      </w:r>
-      <w:proofErr w:type="spellStart"/>
+        <w:t>in order</w:t>
+      </w:r>
       <w:r>
         <w:rPr>
           <w:b/>
           <w:bCs/>
           <w:lang w:val="en-US"/>
         </w:rPr>
-        <w:t>wget</w:t>
-      </w:r>
-      <w:proofErr w:type="spellEnd"/>
+        <w:t xml:space="preserve"> </w:t>
+      </w:r>
+      <w:r>
+        <w:rPr>
+          <w:lang w:val="en-US"/>
+        </w:rPr>
+        <w:t>download go.</w:t>
+      </w:r>
+    </w:p>
+    <w:p>
+      <w:pPr>
+        <w:ind w:left="720"/>
+        <w:jc w:val="both"/>
+        <w:rPr>
+          <w:lang w:val="en-US"/>
+        </w:rPr>
+      </w:pPr>
+      <w:r>
+        <w:rPr>
+          <w:lang w:val="en-US"/>
+        </w:rPr>
+        <w:t xml:space="preserve">Next I run </w:t>
+      </w:r>
       <w:r>
         <w:rPr>
           <w:b/>
           <w:bCs/>
           <w:lang w:val="en-US"/>
         </w:rPr>
-        <w:t xml:space="preserve"> https://go.dev/dl/go1.16.15.linux-amd64.tar.gz</w:t>
+        <w:t>tar -C . -xzf go1.16.15.linux-amd64.tar.gz</w:t>
+      </w:r>
+      <w:r>
+        <w:rPr>
+          <w:lang w:val="en-US"/>
+        </w:rPr>
+        <w:t xml:space="preserve"> to extract the file in the current directory and set the environmental variable with </w:t>
       </w:r>
       <w:r>
         <w:rPr>
@@ -1338,13 +1334,28 @@
           <w:bCs/>
           <w:lang w:val="en-US"/>
         </w:rPr>
-        <w:t xml:space="preserve"> </w:t>
-      </w:r>
-      <w:r>
-        <w:rPr>
-          <w:lang w:val="en-US"/>
-        </w:rPr>
-        <w:t>in order</w:t>
+        <w:t>ENV PATH="$PATH:/usr/src/app/go/bin"</w:t>
+      </w:r>
+      <w:r>
+        <w:rPr>
+          <w:lang w:val="en-US"/>
+        </w:rPr>
+        <w:t>.</w:t>
+      </w:r>
+    </w:p>
+    <w:p>
+      <w:pPr>
+        <w:ind w:left="720"/>
+        <w:jc w:val="both"/>
+        <w:rPr>
+          <w:lang w:val="en-US"/>
+        </w:rPr>
+      </w:pPr>
+      <w:r>
+        <w:rPr>
+          <w:lang w:val="en-US"/>
+        </w:rPr>
+        <w:t xml:space="preserve">Next I copy the backend project in my container with </w:t>
       </w:r>
       <w:r>
         <w:rPr>
@@ -1352,13 +1363,37 @@
           <w:bCs/>
           <w:lang w:val="en-US"/>
         </w:rPr>
-        <w:t xml:space="preserve"> </w:t>
-      </w:r>
-      <w:r>
-        <w:rPr>
-          <w:lang w:val="en-US"/>
-        </w:rPr>
-        <w:t>download go.</w:t>
+        <w:t>COPY . .</w:t>
+      </w:r>
+      <w:r>
+        <w:rPr>
+          <w:lang w:val="en-US"/>
+        </w:rPr>
+        <w:t xml:space="preserve"> and run </w:t>
+      </w:r>
+      <w:r>
+        <w:rPr>
+          <w:lang w:val="en-US"/>
+        </w:rPr>
+        <w:t>go build</w:t>
+      </w:r>
+      <w:r>
+        <w:rPr>
+          <w:lang w:val="en-US"/>
+        </w:rPr>
+        <w:t xml:space="preserve"> as specified in README file to </w:t>
+      </w:r>
+      <w:r>
+        <w:rPr>
+          <w:lang w:val="en-US"/>
+        </w:rPr>
+        <w:t>generate a binary named "server"</w:t>
+      </w:r>
+      <w:r>
+        <w:rPr>
+          <w:lang w:val="en-US"/>
+        </w:rPr>
+        <w:t>.</w:t>
       </w:r>
     </w:p>
     <w:p>
@@ -1373,7 +1408,7 @@
         <w:rPr>
           <w:lang w:val="en-US"/>
         </w:rPr>
-        <w:t xml:space="preserve">Next I run </w:t>
+        <w:t xml:space="preserve">Finally I specify type </w:t>
       </w:r>
       <w:r>
         <w:rPr>
@@ -1381,99 +1416,27 @@
           <w:bCs/>
           <w:lang w:val="en-US"/>
         </w:rPr>
-        <w:t>tar -</w:t>
-      </w:r>
-      <w:proofErr w:type="gramStart"/>
+        <w:t>docker build . -t go-project &amp;&amp; docker run --rm -d -p 8080:8080 go-project ./server</w:t>
+      </w:r>
+      <w:r>
+        <w:rPr>
+          <w:lang w:val="en-US"/>
+        </w:rPr>
+        <w:t>. This</w:t>
+      </w:r>
       <w:r>
         <w:rPr>
           <w:b/>
           <w:bCs/>
           <w:lang w:val="en-US"/>
         </w:rPr>
-        <w:t>C .</w:t>
-      </w:r>
-      <w:proofErr w:type="gramEnd"/>
-      <w:r>
-        <w:rPr>
-          <w:b/>
-          <w:bCs/>
-          <w:lang w:val="en-US"/>
-        </w:rPr>
-        <w:t xml:space="preserve"> -</w:t>
-      </w:r>
-      <w:proofErr w:type="spellStart"/>
-      <w:r>
-        <w:rPr>
-          <w:b/>
-          <w:bCs/>
-          <w:lang w:val="en-US"/>
-        </w:rPr>
-        <w:t>xzf</w:t>
-      </w:r>
-      <w:proofErr w:type="spellEnd"/>
-      <w:r>
-        <w:rPr>
-          <w:b/>
-          <w:bCs/>
-          <w:lang w:val="en-US"/>
-        </w:rPr>
-        <w:t xml:space="preserve"> go1.16.15.linux-amd64.tar.gz</w:t>
-      </w:r>
-      <w:r>
-        <w:rPr>
-          <w:lang w:val="en-US"/>
-        </w:rPr>
-        <w:t xml:space="preserve"> to extract the file in the current directory and set the environmental variable with </w:t>
-      </w:r>
-      <w:r>
-        <w:rPr>
-          <w:b/>
-          <w:bCs/>
-          <w:lang w:val="en-US"/>
-        </w:rPr>
-        <w:t>ENV PATH="$PATH:/</w:t>
-      </w:r>
-      <w:proofErr w:type="spellStart"/>
-      <w:r>
-        <w:rPr>
-          <w:b/>
-          <w:bCs/>
-          <w:lang w:val="en-US"/>
-        </w:rPr>
-        <w:t>usr</w:t>
-      </w:r>
-      <w:proofErr w:type="spellEnd"/>
-      <w:r>
-        <w:rPr>
-          <w:b/>
-          <w:bCs/>
-          <w:lang w:val="en-US"/>
-        </w:rPr>
-        <w:t>/</w:t>
-      </w:r>
-      <w:proofErr w:type="spellStart"/>
-      <w:r>
-        <w:rPr>
-          <w:b/>
-          <w:bCs/>
-          <w:lang w:val="en-US"/>
-        </w:rPr>
-        <w:t>src</w:t>
-      </w:r>
-      <w:proofErr w:type="spellEnd"/>
-      <w:r>
-        <w:rPr>
-          <w:b/>
-          <w:bCs/>
-          <w:lang w:val="en-US"/>
-        </w:rPr>
-        <w:t>/app/go/bin"</w:t>
-      </w:r>
-      <w:r>
-        <w:rPr>
-          <w:lang w:val="en-US"/>
-        </w:rPr>
-        <w:t>.</w:t>
+        <w:t xml:space="preserve"> way I build the image and then run it specifying ./server </w:t>
+      </w:r>
+      <w:r>
+        <w:rPr>
+          <w:lang w:val="en-US"/>
+        </w:rPr>
+        <w:t xml:space="preserve">as the README file states. </w:t>
       </w:r>
     </w:p>
     <w:p>
@@ -1488,55 +1451,7 @@
         <w:rPr>
           <w:lang w:val="en-US"/>
         </w:rPr>
-        <w:t xml:space="preserve">Next I copy the backend project in my container with </w:t>
-      </w:r>
-      <w:proofErr w:type="gramStart"/>
-      <w:r>
-        <w:rPr>
-          <w:b/>
-          <w:bCs/>
-          <w:lang w:val="en-US"/>
-        </w:rPr>
-        <w:t>COPY .</w:t>
-      </w:r>
-      <w:proofErr w:type="gramEnd"/>
-      <w:r>
-        <w:rPr>
-          <w:b/>
-          <w:bCs/>
-          <w:lang w:val="en-US"/>
-        </w:rPr>
-        <w:t xml:space="preserve"> .</w:t>
-      </w:r>
-      <w:r>
-        <w:rPr>
-          <w:lang w:val="en-US"/>
-        </w:rPr>
-        <w:t xml:space="preserve"> and run </w:t>
-      </w:r>
-      <w:r>
-        <w:rPr>
-          <w:lang w:val="en-US"/>
-        </w:rPr>
-        <w:t>go build</w:t>
-      </w:r>
-      <w:r>
-        <w:rPr>
-          <w:lang w:val="en-US"/>
-        </w:rPr>
-        <w:t xml:space="preserve"> as specified in README file to </w:t>
-      </w:r>
-      <w:r>
-        <w:rPr>
-          <w:lang w:val="en-US"/>
-        </w:rPr>
-        <w:t>generate a binary named "server"</w:t>
-      </w:r>
-      <w:r>
-        <w:rPr>
-          <w:lang w:val="en-US"/>
-        </w:rPr>
-        <w:t>.</w:t>
+        <w:t xml:space="preserve">The result is the following: </w:t>
       </w:r>
     </w:p>
     <w:p>
@@ -1549,118 +1464,7 @@
       </w:pPr>
       <w:r>
         <w:rPr>
-          <w:lang w:val="en-US"/>
-        </w:rPr>
-        <w:t xml:space="preserve">Finally I specify type </w:t>
-      </w:r>
-      <w:r>
-        <w:rPr>
-          <w:b/>
-          <w:bCs/>
-          <w:lang w:val="en-US"/>
-        </w:rPr>
-        <w:t xml:space="preserve">docker </w:t>
-      </w:r>
-      <w:proofErr w:type="gramStart"/>
-      <w:r>
-        <w:rPr>
-          <w:b/>
-          <w:bCs/>
-          <w:lang w:val="en-US"/>
-        </w:rPr>
-        <w:t>build .</w:t>
-      </w:r>
-      <w:proofErr w:type="gramEnd"/>
-      <w:r>
-        <w:rPr>
-          <w:b/>
-          <w:bCs/>
-          <w:lang w:val="en-US"/>
-        </w:rPr>
-        <w:t xml:space="preserve"> -t go-project &amp;&amp; docker run --rm -d -p 8080:8080 go-</w:t>
-      </w:r>
-      <w:proofErr w:type="gramStart"/>
-      <w:r>
-        <w:rPr>
-          <w:b/>
-          <w:bCs/>
-          <w:lang w:val="en-US"/>
-        </w:rPr>
-        <w:t>project .</w:t>
-      </w:r>
-      <w:proofErr w:type="gramEnd"/>
-      <w:r>
-        <w:rPr>
-          <w:b/>
-          <w:bCs/>
-          <w:lang w:val="en-US"/>
-        </w:rPr>
-        <w:t>/server</w:t>
-      </w:r>
-      <w:r>
-        <w:rPr>
-          <w:lang w:val="en-US"/>
-        </w:rPr>
-        <w:t>. This</w:t>
-      </w:r>
-      <w:r>
-        <w:rPr>
-          <w:b/>
-          <w:bCs/>
-          <w:lang w:val="en-US"/>
-        </w:rPr>
-        <w:t xml:space="preserve"> way I build the image and then run it </w:t>
-      </w:r>
-      <w:proofErr w:type="gramStart"/>
-      <w:r>
-        <w:rPr>
-          <w:b/>
-          <w:bCs/>
-          <w:lang w:val="en-US"/>
-        </w:rPr>
-        <w:t>specifying .</w:t>
-      </w:r>
-      <w:proofErr w:type="gramEnd"/>
-      <w:r>
-        <w:rPr>
-          <w:b/>
-          <w:bCs/>
-          <w:lang w:val="en-US"/>
-        </w:rPr>
-        <w:t xml:space="preserve">/server </w:t>
-      </w:r>
-      <w:r>
-        <w:rPr>
-          <w:lang w:val="en-US"/>
-        </w:rPr>
-        <w:t xml:space="preserve">as the README file states. </w:t>
-      </w:r>
-    </w:p>
-    <w:p>
-      <w:pPr>
-        <w:ind w:left="720"/>
-        <w:jc w:val="both"/>
-        <w:rPr>
-          <w:lang w:val="en-US"/>
-        </w:rPr>
-      </w:pPr>
-      <w:r>
-        <w:rPr>
-          <w:lang w:val="en-US"/>
-        </w:rPr>
-        <w:t xml:space="preserve">The result is the following: </w:t>
-      </w:r>
-    </w:p>
-    <w:p>
-      <w:pPr>
-        <w:ind w:left="720"/>
-        <w:jc w:val="both"/>
-        <w:rPr>
-          <w:lang w:val="en-US"/>
-        </w:rPr>
-      </w:pPr>
-      <w:r>
-        <w:rPr>
+          <w:noProof/>
           <w:lang w:val="en-US"/>
         </w:rPr>
         <w:drawing>
@@ -2570,6 +2374,7 @@
   <w:style w:type="character" w:default="1" w:styleId="DefaultParagraphFont">
     <w:name w:val="Default Paragraph Font"/>
     <w:uiPriority w:val="1"/>
+    <w:semiHidden/>
     <w:unhideWhenUsed/>
   </w:style>
   <w:style w:type="table" w:default="1" w:styleId="TableNormal">

</xml_diff>